<commit_message>
Move 네일 to DAY1 after shopping in ₩3,990,000 package
Co-Authored-By: Claude Sonnet 4.6 <noreply@anthropic.com>
Claude-Session: https://claude.ai/code/session_01MLXVgnN287g9x8qaYbB4vD
</commit_message>
<xml_diff>
--- a/packages/고객공유용_399만원_SeoulPrestige.docx
+++ b/packages/고객공유용_399만원_SeoulPrestige.docx
@@ -1047,11 +1047,169 @@
                 <w:rFonts w:ascii="Malgun Gothic" w:hAnsi="Malgun Gothic"/>
                 <w:sz w:val="18"/>
               </w:rPr>
-              <w:t>18:30</w:t>
+              <w:t>17:30</w:t>
               <w:br/>
               <w:t>~</w:t>
               <w:br/>
-              <w:t>20:30</w:t>
+              <w:t>19:00</w:t>
+            </w:r>
+          </w:p>
+        </w:tc>
+        <w:tc>
+          <w:tcPr>
+            <w:tcW w:type="dxa" w:w="6520"/>
+          </w:tcPr>
+          <w:p>
+            <w:pPr>
+              <w:spacing w:before="20" w:after="20"/>
+            </w:pPr>
+            <w:r>
+              <w:rPr>
+                <w:rFonts w:ascii="Malgun Gothic" w:hAnsi="Malgun Gothic"/>
+                <w:b/>
+                <w:sz w:val="18"/>
+              </w:rPr>
+              <w:t>네일 케어 럭셔리  (90분)</w:t>
+            </w:r>
+          </w:p>
+          <w:p>
+            <w:pPr>
+              <w:spacing w:before="20" w:after="20"/>
+            </w:pPr>
+            <w:r>
+              <w:rPr>
+                <w:rFonts w:ascii="Malgun Gothic" w:hAnsi="Malgun Gothic"/>
+                <w:sz w:val="18"/>
+              </w:rPr>
+              <w:t>· 프리미엄 젤 네일 (퍼스널컬러 기반 컬러 추천)</w:t>
+            </w:r>
+          </w:p>
+          <w:p>
+            <w:pPr>
+              <w:spacing w:before="20" w:after="20"/>
+            </w:pPr>
+            <w:r>
+              <w:rPr>
+                <w:rFonts w:ascii="Malgun Gothic" w:hAnsi="Malgun Gothic"/>
+                <w:sz w:val="18"/>
+              </w:rPr>
+              <w:t>· 핸드 케어 + 큐티클 정리 + 파라핀 트리트먼트</w:t>
+            </w:r>
+          </w:p>
+          <w:p>
+            <w:pPr>
+              <w:spacing w:before="20" w:after="20"/>
+            </w:pPr>
+            <w:r>
+              <w:rPr>
+                <w:rFonts w:ascii="Malgun Gothic" w:hAnsi="Malgun Gothic"/>
+                <w:sz w:val="18"/>
+              </w:rPr>
+            </w:r>
+          </w:p>
+          <w:p>
+            <w:pPr>
+              <w:spacing w:before="20" w:after="20"/>
+            </w:pPr>
+            <w:r>
+              <w:rPr>
+                <w:rFonts w:ascii="Malgun Gothic" w:hAnsi="Malgun Gothic"/>
+                <w:sz w:val="18"/>
+              </w:rPr>
+              <w:t>추천 업체 TOP5</w:t>
+            </w:r>
+          </w:p>
+          <w:p>
+            <w:pPr>
+              <w:spacing w:before="20" w:after="20"/>
+            </w:pPr>
+            <w:r>
+              <w:rPr>
+                <w:rFonts w:ascii="Malgun Gothic" w:hAnsi="Malgun Gothic"/>
+                <w:sz w:val="18"/>
+              </w:rPr>
+              <w:t>① 네일팝  ② 에뛰드네일  ③ 글로시네일</w:t>
+            </w:r>
+          </w:p>
+          <w:p>
+            <w:pPr>
+              <w:spacing w:before="20" w:after="20"/>
+            </w:pPr>
+            <w:r>
+              <w:rPr>
+                <w:rFonts w:ascii="Malgun Gothic" w:hAnsi="Malgun Gothic"/>
+                <w:sz w:val="18"/>
+              </w:rPr>
+              <w:t>④ 핑크네일명동  ⑤ 네일아트클럽</w:t>
+            </w:r>
+          </w:p>
+          <w:p>
+            <w:pPr>
+              <w:spacing w:before="20" w:after="20"/>
+            </w:pPr>
+            <w:r>
+              <w:rPr>
+                <w:rFonts w:ascii="Malgun Gothic" w:hAnsi="Malgun Gothic"/>
+                <w:sz w:val="18"/>
+              </w:rPr>
+            </w:r>
+          </w:p>
+          <w:p>
+            <w:pPr>
+              <w:spacing w:before="20" w:after="20"/>
+            </w:pPr>
+            <w:r>
+              <w:rPr>
+                <w:rFonts w:ascii="Malgun Gothic" w:hAnsi="Malgun Gothic"/>
+                <w:sz w:val="18"/>
+              </w:rPr>
+              <w:t>💡 쇼핑 직후 퍼스널컬러 기반 네일 컬러 선택.</w:t>
+            </w:r>
+          </w:p>
+          <w:p>
+            <w:pPr>
+              <w:spacing w:before="20" w:after="20"/>
+            </w:pPr>
+            <w:r>
+              <w:rPr>
+                <w:rFonts w:ascii="Malgun Gothic" w:hAnsi="Malgun Gothic"/>
+                <w:sz w:val="18"/>
+              </w:rPr>
+              <w:t xml:space="preserve">   여행 첫날 손끝까지 완성하면 남은 2일이 더 빛남</w:t>
+            </w:r>
+          </w:p>
+        </w:tc>
+        <w:tc>
+          <w:tcPr>
+            <w:tcW w:type="dxa" w:w="1417"/>
+          </w:tcPr>
+          <w:p>
+            <w:r>
+              <w:rPr>
+                <w:rFonts w:ascii="Malgun Gothic" w:hAnsi="Malgun Gothic"/>
+                <w:sz w:val="18"/>
+              </w:rPr>
+              <w:t>✅ 포함</w:t>
+            </w:r>
+          </w:p>
+        </w:tc>
+      </w:tr>
+      <w:tr>
+        <w:tc>
+          <w:tcPr>
+            <w:tcW w:type="dxa" w:w="1134"/>
+          </w:tcPr>
+          <w:p>
+            <w:r>
+              <w:rPr>
+                <w:rFonts w:ascii="Malgun Gothic" w:hAnsi="Malgun Gothic"/>
+                <w:sz w:val="18"/>
+              </w:rPr>
+              <w:t>19:30</w:t>
+              <w:br/>
+              <w:t>~</w:t>
+              <w:br/>
+              <w:t>21:30</w:t>
             </w:r>
           </w:p>
         </w:tc>
@@ -1205,7 +1363,7 @@
                 <w:rFonts w:ascii="Malgun Gothic" w:hAnsi="Malgun Gothic"/>
                 <w:sz w:val="18"/>
               </w:rPr>
-              <w:t>21:00</w:t>
+              <w:t>22:00</w:t>
             </w:r>
           </w:p>
         </w:tc>
@@ -1670,152 +1828,6 @@
                 <w:sz w:val="18"/>
               </w:rPr>
               <w:t>15:30</w:t>
-              <w:br/>
-              <w:t>~</w:t>
-              <w:br/>
-              <w:t>17:00</w:t>
-            </w:r>
-          </w:p>
-        </w:tc>
-        <w:tc>
-          <w:tcPr>
-            <w:tcW w:type="dxa" w:w="6520"/>
-          </w:tcPr>
-          <w:p>
-            <w:pPr>
-              <w:spacing w:before="20" w:after="20"/>
-            </w:pPr>
-            <w:r>
-              <w:rPr>
-                <w:rFonts w:ascii="Malgun Gothic" w:hAnsi="Malgun Gothic"/>
-                <w:b/>
-                <w:sz w:val="18"/>
-              </w:rPr>
-              <w:t>네일 케어 럭셔리  (90분)</w:t>
-            </w:r>
-          </w:p>
-          <w:p>
-            <w:pPr>
-              <w:spacing w:before="20" w:after="20"/>
-            </w:pPr>
-            <w:r>
-              <w:rPr>
-                <w:rFonts w:ascii="Malgun Gothic" w:hAnsi="Malgun Gothic"/>
-                <w:sz w:val="18"/>
-              </w:rPr>
-              <w:t>· 프리미엄 젤 네일 (퍼스널컬러 기반 컬러 추천)</w:t>
-            </w:r>
-          </w:p>
-          <w:p>
-            <w:pPr>
-              <w:spacing w:before="20" w:after="20"/>
-            </w:pPr>
-            <w:r>
-              <w:rPr>
-                <w:rFonts w:ascii="Malgun Gothic" w:hAnsi="Malgun Gothic"/>
-                <w:sz w:val="18"/>
-              </w:rPr>
-              <w:t>· 핸드 케어 + 큐티클 정리 + 파라핀 트리트먼트</w:t>
-            </w:r>
-          </w:p>
-          <w:p>
-            <w:pPr>
-              <w:spacing w:before="20" w:after="20"/>
-            </w:pPr>
-            <w:r>
-              <w:rPr>
-                <w:rFonts w:ascii="Malgun Gothic" w:hAnsi="Malgun Gothic"/>
-                <w:sz w:val="18"/>
-              </w:rPr>
-            </w:r>
-          </w:p>
-          <w:p>
-            <w:pPr>
-              <w:spacing w:before="20" w:after="20"/>
-            </w:pPr>
-            <w:r>
-              <w:rPr>
-                <w:rFonts w:ascii="Malgun Gothic" w:hAnsi="Malgun Gothic"/>
-                <w:sz w:val="18"/>
-              </w:rPr>
-              <w:t>추천 업체 TOP5</w:t>
-            </w:r>
-          </w:p>
-          <w:p>
-            <w:pPr>
-              <w:spacing w:before="20" w:after="20"/>
-            </w:pPr>
-            <w:r>
-              <w:rPr>
-                <w:rFonts w:ascii="Malgun Gothic" w:hAnsi="Malgun Gothic"/>
-                <w:sz w:val="18"/>
-              </w:rPr>
-              <w:t>① 네일팝  ② 에뛰드네일  ③ 글로시네일</w:t>
-            </w:r>
-          </w:p>
-          <w:p>
-            <w:pPr>
-              <w:spacing w:before="20" w:after="20"/>
-            </w:pPr>
-            <w:r>
-              <w:rPr>
-                <w:rFonts w:ascii="Malgun Gothic" w:hAnsi="Malgun Gothic"/>
-                <w:sz w:val="18"/>
-              </w:rPr>
-              <w:t>④ 핑크네일명동  ⑤ 네일아트클럽</w:t>
-            </w:r>
-          </w:p>
-          <w:p>
-            <w:pPr>
-              <w:spacing w:before="20" w:after="20"/>
-            </w:pPr>
-            <w:r>
-              <w:rPr>
-                <w:rFonts w:ascii="Malgun Gothic" w:hAnsi="Malgun Gothic"/>
-                <w:sz w:val="18"/>
-              </w:rPr>
-            </w:r>
-          </w:p>
-          <w:p>
-            <w:pPr>
-              <w:spacing w:before="20" w:after="20"/>
-            </w:pPr>
-            <w:r>
-              <w:rPr>
-                <w:rFonts w:ascii="Malgun Gothic" w:hAnsi="Malgun Gothic"/>
-                <w:sz w:val="18"/>
-              </w:rPr>
-              <w:t>💡 손끝까지 완성된 상태로 내일 촬영 임하기</w:t>
-            </w:r>
-          </w:p>
-        </w:tc>
-        <w:tc>
-          <w:tcPr>
-            <w:tcW w:type="dxa" w:w="1417"/>
-          </w:tcPr>
-          <w:p>
-            <w:r>
-              <w:rPr>
-                <w:rFonts w:ascii="Malgun Gothic" w:hAnsi="Malgun Gothic"/>
-                <w:sz w:val="18"/>
-              </w:rPr>
-              <w:t>✅ 포함</w:t>
-            </w:r>
-          </w:p>
-        </w:tc>
-      </w:tr>
-      <w:tr>
-        <w:tc>
-          <w:tcPr>
-            <w:tcW w:type="dxa" w:w="1134"/>
-          </w:tcPr>
-          <w:p>
-            <w:r>
-              <w:rPr>
-                <w:rFonts w:ascii="Malgun Gothic" w:hAnsi="Malgun Gothic"/>
-                <w:sz w:val="18"/>
-              </w:rPr>
-              <w:t>18:00</w:t>
             </w:r>
           </w:p>
         </w:tc>
@@ -2508,6 +2520,17 @@
         <w:rPr>
           <w:rFonts w:ascii="Malgun Gothic" w:hAnsi="Malgun Gothic"/>
         </w:rPr>
+        <w:t>DAY1  럭셔리 네일 케어</w:t>
+      </w:r>
+    </w:p>
+    <w:p>
+      <w:pPr>
+        <w:pStyle w:val="ListBullet"/>
+      </w:pPr>
+      <w:r>
+        <w:rPr>
+          <w:rFonts w:ascii="Malgun Gothic" w:hAnsi="Malgun Gothic"/>
+        </w:rPr>
         <w:t>DAY1  한식 오마카세 코스 디너</w:t>
       </w:r>
     </w:p>
@@ -2531,17 +2554,6 @@
           <w:rFonts w:ascii="Malgun Gothic" w:hAnsi="Malgun Gothic"/>
         </w:rPr>
         <w:t>DAY2  헤드스파 or 전신 마사지 (선택)</w:t>
-      </w:r>
-    </w:p>
-    <w:p>
-      <w:pPr>
-        <w:pStyle w:val="ListBullet"/>
-      </w:pPr>
-      <w:r>
-        <w:rPr>
-          <w:rFonts w:ascii="Malgun Gothic" w:hAnsi="Malgun Gothic"/>
-        </w:rPr>
-        <w:t>DAY2  럭셔리 네일 케어</w:t>
       </w:r>
     </w:p>
     <w:p>

</xml_diff>

<commit_message>
Add 티 오마카세 to DAY2 of 399만원 Seoul Prestige package
</commit_message>
<xml_diff>
--- a/packages/고객공유용_399만원_SeoulPrestige.docx
+++ b/packages/고객공유용_399만원_SeoulPrestige.docx
@@ -1828,6 +1828,176 @@
                 <w:sz w:val="18"/>
               </w:rPr>
               <w:t>15:30</w:t>
+              <w:br/>
+              <w:t>~</w:t>
+              <w:br/>
+              <w:t>16:30</w:t>
+            </w:r>
+          </w:p>
+        </w:tc>
+        <w:tc>
+          <w:tcPr>
+            <w:tcW w:type="dxa" w:w="6520"/>
+          </w:tcPr>
+          <w:p>
+            <w:pPr>
+              <w:spacing w:before="20" w:after="20"/>
+            </w:pPr>
+            <w:r>
+              <w:rPr>
+                <w:rFonts w:ascii="Malgun Gothic" w:hAnsi="Malgun Gothic"/>
+                <w:b/>
+                <w:sz w:val="18"/>
+              </w:rPr>
+              <w:t>티 오마카세  (1시간)</w:t>
+            </w:r>
+          </w:p>
+          <w:p>
+            <w:pPr>
+              <w:spacing w:before="20" w:after="20"/>
+            </w:pPr>
+            <w:r>
+              <w:rPr>
+                <w:rFonts w:ascii="Malgun Gothic" w:hAnsi="Malgun Gothic"/>
+                <w:sz w:val="18"/>
+              </w:rPr>
+              <w:t>· 전통차 소믈리에가 선별한 계절 차 코스 제공</w:t>
+            </w:r>
+          </w:p>
+          <w:p>
+            <w:pPr>
+              <w:spacing w:before="20" w:after="20"/>
+            </w:pPr>
+            <w:r>
+              <w:rPr>
+                <w:rFonts w:ascii="Malgun Gothic" w:hAnsi="Malgun Gothic"/>
+                <w:sz w:val="18"/>
+              </w:rPr>
+              <w:t>· 차 설명 + 다과 페어링 포함</w:t>
+            </w:r>
+          </w:p>
+          <w:p>
+            <w:pPr>
+              <w:spacing w:before="20" w:after="20"/>
+            </w:pPr>
+            <w:r>
+              <w:rPr>
+                <w:rFonts w:ascii="Malgun Gothic" w:hAnsi="Malgun Gothic"/>
+                <w:sz w:val="18"/>
+              </w:rPr>
+              <w:t>· 명동·인사동 인근 프리미엄 티룸</w:t>
+            </w:r>
+          </w:p>
+          <w:p>
+            <w:pPr>
+              <w:spacing w:before="20" w:after="20"/>
+            </w:pPr>
+            <w:r>
+              <w:rPr>
+                <w:rFonts w:ascii="Malgun Gothic" w:hAnsi="Malgun Gothic"/>
+                <w:sz w:val="18"/>
+              </w:rPr>
+            </w:r>
+          </w:p>
+          <w:p>
+            <w:pPr>
+              <w:spacing w:before="20" w:after="20"/>
+            </w:pPr>
+            <w:r>
+              <w:rPr>
+                <w:rFonts w:ascii="Malgun Gothic" w:hAnsi="Malgun Gothic"/>
+                <w:sz w:val="18"/>
+              </w:rPr>
+              <w:t>추천 업체 TOP5</w:t>
+            </w:r>
+          </w:p>
+          <w:p>
+            <w:pPr>
+              <w:spacing w:before="20" w:after="20"/>
+            </w:pPr>
+            <w:r>
+              <w:rPr>
+                <w:rFonts w:ascii="Malgun Gothic" w:hAnsi="Malgun Gothic"/>
+                <w:sz w:val="18"/>
+              </w:rPr>
+              <w:t>① 오설록 티하우스  ② 차마시는 뜰  ③ 티컬렉티브</w:t>
+            </w:r>
+          </w:p>
+          <w:p>
+            <w:pPr>
+              <w:spacing w:before="20" w:after="20"/>
+            </w:pPr>
+            <w:r>
+              <w:rPr>
+                <w:rFonts w:ascii="Malgun Gothic" w:hAnsi="Malgun Gothic"/>
+                <w:sz w:val="18"/>
+              </w:rPr>
+              <w:t>④ 명가원  ⑤ 오우재</w:t>
+            </w:r>
+          </w:p>
+          <w:p>
+            <w:pPr>
+              <w:spacing w:before="20" w:after="20"/>
+            </w:pPr>
+            <w:r>
+              <w:rPr>
+                <w:rFonts w:ascii="Malgun Gothic" w:hAnsi="Malgun Gothic"/>
+                <w:sz w:val="18"/>
+              </w:rPr>
+            </w:r>
+          </w:p>
+          <w:p>
+            <w:pPr>
+              <w:spacing w:before="20" w:after="20"/>
+            </w:pPr>
+            <w:r>
+              <w:rPr>
+                <w:rFonts w:ascii="Malgun Gothic" w:hAnsi="Malgun Gothic"/>
+                <w:sz w:val="18"/>
+              </w:rPr>
+              <w:t>💡 반영구·마사지 후 차분하게 마무리.</w:t>
+            </w:r>
+          </w:p>
+          <w:p>
+            <w:pPr>
+              <w:spacing w:before="20" w:after="20"/>
+            </w:pPr>
+            <w:r>
+              <w:rPr>
+                <w:rFonts w:ascii="Malgun Gothic" w:hAnsi="Malgun Gothic"/>
+                <w:sz w:val="18"/>
+              </w:rPr>
+              <w:t xml:space="preserve">   내일 촬영을 앞두고 몸과 마음을 고요하게 정돈</w:t>
+            </w:r>
+          </w:p>
+        </w:tc>
+        <w:tc>
+          <w:tcPr>
+            <w:tcW w:type="dxa" w:w="1417"/>
+          </w:tcPr>
+          <w:p>
+            <w:r>
+              <w:rPr>
+                <w:rFonts w:ascii="Malgun Gothic" w:hAnsi="Malgun Gothic"/>
+                <w:sz w:val="18"/>
+              </w:rPr>
+              <w:t>✅ 포함</w:t>
+            </w:r>
+          </w:p>
+        </w:tc>
+      </w:tr>
+      <w:tr>
+        <w:tc>
+          <w:tcPr>
+            <w:tcW w:type="dxa" w:w="1134"/>
+          </w:tcPr>
+          <w:p>
+            <w:r>
+              <w:rPr>
+                <w:rFonts w:ascii="Malgun Gothic" w:hAnsi="Malgun Gothic"/>
+                <w:sz w:val="18"/>
+              </w:rPr>
+              <w:t>17:00</w:t>
             </w:r>
           </w:p>
         </w:tc>

</xml_diff>